<commit_message>
Ajustements multiples (cohérence, timing, types d'exercices, etc.)
</commit_message>
<xml_diff>
--- a/EBIOS Risk Manager - Formation - Livret formateur.docx
+++ b/EBIOS Risk Manager - Formation - Livret formateur.docx
@@ -106,7 +106,6 @@
         <w:dataBinding w:prefixMappings="xmlns:ns0='http://schemas.openxmlformats.org/package/2006/metadata/core-properties' xmlns:ns1='http://purl.org/dc/elements/1.1/'" w:xpath="/ns0:coreProperties[1]/ns1:title[1]" w:storeItemID="{6C3C8BC8-F283-45AE-878A-BAB7291924A1}"/>
         <w:text/>
       </w:sdtPr>
-      <w:sdtEndPr/>
       <w:sdtContent>
         <w:p>
           <w:pPr>
@@ -143,7 +142,6 @@
           <w:dataBinding w:prefixMappings="xmlns:ns0='http://schemas.openxmlformats.org/package/2006/metadata/core-properties' xmlns:ns1='http://purl.org/dc/elements/1.1/'" w:xpath="/ns0:coreProperties[1]/ns1:subject[1]" w:storeItemID="{6C3C8BC8-F283-45AE-878A-BAB7291924A1}"/>
           <w:text/>
         </w:sdtPr>
-        <w:sdtEndPr/>
         <w:sdtContent>
           <w:r>
             <w:rPr>
@@ -552,6 +550,67 @@
           <w:p>
             <w:r>
               <w:t>Corrections mineures</w:t>
+            </w:r>
+          </w:p>
+        </w:tc>
+        <w:tc>
+          <w:tcPr>
+            <w:tcW w:w="1721" w:type="pct"/>
+            <w:vAlign w:val="center"/>
+          </w:tcPr>
+          <w:p>
+            <w:pPr>
+              <w:jc w:val="left"/>
+            </w:pPr>
+            <w:r>
+              <w:t>Matthieu GRALL</w:t>
+            </w:r>
+          </w:p>
+        </w:tc>
+        <w:tc>
+          <w:tcPr>
+            <w:tcW w:w="750" w:type="pct"/>
+            <w:vAlign w:val="center"/>
+          </w:tcPr>
+          <w:p>
+            <w:r>
+              <w:t>Amélioration continue</w:t>
+            </w:r>
+          </w:p>
+        </w:tc>
+      </w:tr>
+      <w:tr>
+        <w:trPr>
+          <w:jc w:val="center"/>
+        </w:trPr>
+        <w:tc>
+          <w:tcPr>
+            <w:tcW w:w="696" w:type="pct"/>
+            <w:vAlign w:val="center"/>
+          </w:tcPr>
+          <w:p>
+            <w:pPr>
+              <w:jc w:val="right"/>
+            </w:pPr>
+            <w:r>
+              <w:t>19/11/2025</w:t>
+            </w:r>
+          </w:p>
+        </w:tc>
+        <w:tc>
+          <w:tcPr>
+            <w:tcW w:w="1833" w:type="pct"/>
+            <w:vAlign w:val="center"/>
+          </w:tcPr>
+          <w:p>
+            <w:r>
+              <w:t>Révision du timing</w:t>
+            </w:r>
+            <w:r>
+              <w:t xml:space="preserve"> et du type d’exercices de l’étude de cas</w:t>
+            </w:r>
+            <w:r>
+              <w:t>, et corrections mineures</w:t>
             </w:r>
           </w:p>
         </w:tc>
@@ -721,13 +780,8 @@
       <w:r>
         <w:t xml:space="preserve"> : </w:t>
       </w:r>
-      <w:proofErr w:type="spellStart"/>
       <w:r>
-        <w:t>Grid</w:t>
-      </w:r>
-      <w:proofErr w:type="spellEnd"/>
-      <w:r>
-        <w:t>, par Magic Creative, de PIXABAY</w:t>
+        <w:t>Grid, par Magic Creative, de PIXABAY</w:t>
       </w:r>
     </w:p>
     <w:p>
@@ -1972,31 +2026,13 @@
         </w:numPr>
         <w:spacing w:after="200" w:line="276" w:lineRule="auto"/>
       </w:pPr>
-      <w:proofErr w:type="spellStart"/>
       <w:r>
         <w:rPr>
           <w:i/>
           <w:iCs/>
         </w:rPr>
-        <w:t>paper</w:t>
+        <w:t>paper board</w:t>
       </w:r>
-      <w:proofErr w:type="spellEnd"/>
-      <w:r>
-        <w:rPr>
-          <w:i/>
-          <w:iCs/>
-        </w:rPr>
-        <w:t xml:space="preserve"> </w:t>
-      </w:r>
-      <w:proofErr w:type="spellStart"/>
-      <w:r>
-        <w:rPr>
-          <w:i/>
-          <w:iCs/>
-        </w:rPr>
-        <w:t>board</w:t>
-      </w:r>
-      <w:proofErr w:type="spellEnd"/>
       <w:r>
         <w:t> et feutres ;</w:t>
       </w:r>
@@ -3856,23 +3892,13 @@
                 <w:szCs w:val="20"/>
               </w:rPr>
             </w:pPr>
-            <w:proofErr w:type="gramStart"/>
-            <w:r>
-              <w:rPr>
-                <w:rFonts w:asciiTheme="majorHAnsi" w:hAnsiTheme="majorHAnsi" w:cstheme="majorHAnsi"/>
-                <w:sz w:val="20"/>
-                <w:szCs w:val="20"/>
-              </w:rPr>
-              <w:t>Faire</w:t>
-            </w:r>
-            <w:proofErr w:type="gramEnd"/>
-            <w:r>
-              <w:rPr>
-                <w:rFonts w:asciiTheme="majorHAnsi" w:hAnsiTheme="majorHAnsi" w:cstheme="majorHAnsi"/>
-                <w:sz w:val="20"/>
-                <w:szCs w:val="20"/>
-              </w:rPr>
-              <w:t xml:space="preserve"> un exercice collégial : </w:t>
+            <w:r>
+              <w:rPr>
+                <w:rFonts w:asciiTheme="majorHAnsi" w:hAnsiTheme="majorHAnsi" w:cstheme="majorHAnsi"/>
+                <w:sz w:val="20"/>
+                <w:szCs w:val="20"/>
+              </w:rPr>
+              <w:t xml:space="preserve">Faire un exercice collégial : </w:t>
             </w:r>
             <w:r>
               <w:rPr>
@@ -4335,23 +4361,13 @@
                 <w:szCs w:val="20"/>
               </w:rPr>
             </w:pPr>
-            <w:proofErr w:type="gramStart"/>
-            <w:r>
-              <w:rPr>
-                <w:rFonts w:asciiTheme="majorHAnsi" w:hAnsiTheme="majorHAnsi" w:cstheme="majorHAnsi"/>
-                <w:sz w:val="20"/>
-                <w:szCs w:val="20"/>
-              </w:rPr>
-              <w:t>Faire</w:t>
-            </w:r>
-            <w:proofErr w:type="gramEnd"/>
-            <w:r>
-              <w:rPr>
-                <w:rFonts w:asciiTheme="majorHAnsi" w:hAnsiTheme="majorHAnsi" w:cstheme="majorHAnsi"/>
-                <w:sz w:val="20"/>
-                <w:szCs w:val="20"/>
-              </w:rPr>
-              <w:t xml:space="preserve"> un exercice collégial : pour chaque élément présenté, indique</w:t>
+            <w:r>
+              <w:rPr>
+                <w:rFonts w:asciiTheme="majorHAnsi" w:hAnsiTheme="majorHAnsi" w:cstheme="majorHAnsi"/>
+                <w:sz w:val="20"/>
+                <w:szCs w:val="20"/>
+              </w:rPr>
+              <w:t>Faire un exercice collégial : pour chaque élément présenté, indique</w:t>
             </w:r>
             <w:r>
               <w:rPr>
@@ -4937,7 +4953,19 @@
               <w:rPr>
                 <w:rFonts w:cstheme="majorHAnsi"/>
               </w:rPr>
-              <w:t xml:space="preserve"> (jour 1 matin)</w:t>
+              <w:t xml:space="preserve"> (jour 1 matin</w:t>
+            </w:r>
+            <w:r>
+              <w:rPr>
+                <w:rFonts w:cstheme="majorHAnsi"/>
+              </w:rPr>
+              <w:t xml:space="preserve"> ou début d’après-midi</w:t>
+            </w:r>
+            <w:r>
+              <w:rPr>
+                <w:rFonts w:cstheme="majorHAnsi"/>
+              </w:rPr>
+              <w:t>)</w:t>
             </w:r>
             <w:bookmarkEnd w:id="9"/>
             <w:bookmarkEnd w:id="10"/>
@@ -5268,23 +5296,13 @@
                 <w:szCs w:val="20"/>
               </w:rPr>
             </w:pPr>
-            <w:proofErr w:type="gramStart"/>
-            <w:r>
-              <w:rPr>
-                <w:rFonts w:asciiTheme="majorHAnsi" w:hAnsiTheme="majorHAnsi" w:cstheme="majorHAnsi"/>
-                <w:sz w:val="20"/>
-                <w:szCs w:val="20"/>
-              </w:rPr>
-              <w:t>Faire</w:t>
-            </w:r>
-            <w:proofErr w:type="gramEnd"/>
-            <w:r>
-              <w:rPr>
-                <w:rFonts w:asciiTheme="majorHAnsi" w:hAnsiTheme="majorHAnsi" w:cstheme="majorHAnsi"/>
-                <w:sz w:val="20"/>
-                <w:szCs w:val="20"/>
-              </w:rPr>
-              <w:t xml:space="preserve"> un exercice collégial : pour chaque </w:t>
+            <w:r>
+              <w:rPr>
+                <w:rFonts w:asciiTheme="majorHAnsi" w:hAnsiTheme="majorHAnsi" w:cstheme="majorHAnsi"/>
+                <w:sz w:val="20"/>
+                <w:szCs w:val="20"/>
+              </w:rPr>
+              <w:t xml:space="preserve">Faire un exercice collégial : pour chaque </w:t>
             </w:r>
             <w:r>
               <w:rPr>
@@ -6061,23 +6079,13 @@
                 <w:szCs w:val="20"/>
               </w:rPr>
             </w:pPr>
-            <w:proofErr w:type="gramStart"/>
-            <w:r>
-              <w:rPr>
-                <w:rFonts w:asciiTheme="majorHAnsi" w:hAnsiTheme="majorHAnsi" w:cstheme="majorHAnsi"/>
-                <w:sz w:val="20"/>
-                <w:szCs w:val="20"/>
-              </w:rPr>
-              <w:t>Faire</w:t>
-            </w:r>
-            <w:proofErr w:type="gramEnd"/>
-            <w:r>
-              <w:rPr>
-                <w:rFonts w:asciiTheme="majorHAnsi" w:hAnsiTheme="majorHAnsi" w:cstheme="majorHAnsi"/>
-                <w:sz w:val="20"/>
-                <w:szCs w:val="20"/>
-              </w:rPr>
-              <w:t xml:space="preserve"> un exercice collégial : pour </w:t>
+            <w:r>
+              <w:rPr>
+                <w:rFonts w:asciiTheme="majorHAnsi" w:hAnsiTheme="majorHAnsi" w:cstheme="majorHAnsi"/>
+                <w:sz w:val="20"/>
+                <w:szCs w:val="20"/>
+              </w:rPr>
+              <w:t xml:space="preserve">Faire un exercice collégial : pour </w:t>
             </w:r>
             <w:r>
               <w:rPr>
@@ -6479,23 +6487,13 @@
                 <w:szCs w:val="20"/>
               </w:rPr>
             </w:pPr>
-            <w:proofErr w:type="gramStart"/>
-            <w:r>
-              <w:rPr>
-                <w:rFonts w:asciiTheme="majorHAnsi" w:hAnsiTheme="majorHAnsi" w:cstheme="majorHAnsi"/>
-                <w:sz w:val="20"/>
-                <w:szCs w:val="20"/>
-              </w:rPr>
-              <w:t>Faire</w:t>
-            </w:r>
-            <w:proofErr w:type="gramEnd"/>
-            <w:r>
-              <w:rPr>
-                <w:rFonts w:asciiTheme="majorHAnsi" w:hAnsiTheme="majorHAnsi" w:cstheme="majorHAnsi"/>
-                <w:sz w:val="20"/>
-                <w:szCs w:val="20"/>
-              </w:rPr>
-              <w:t xml:space="preserve"> un exercice collégial : pour </w:t>
+            <w:r>
+              <w:rPr>
+                <w:rFonts w:asciiTheme="majorHAnsi" w:hAnsiTheme="majorHAnsi" w:cstheme="majorHAnsi"/>
+                <w:sz w:val="20"/>
+                <w:szCs w:val="20"/>
+              </w:rPr>
+              <w:t xml:space="preserve">Faire un exercice collégial : pour </w:t>
             </w:r>
             <w:r>
               <w:rPr>
@@ -6877,23 +6875,13 @@
                 <w:szCs w:val="20"/>
               </w:rPr>
             </w:pPr>
-            <w:proofErr w:type="gramStart"/>
-            <w:r>
-              <w:rPr>
-                <w:rFonts w:asciiTheme="majorHAnsi" w:hAnsiTheme="majorHAnsi" w:cstheme="majorHAnsi"/>
-                <w:sz w:val="20"/>
-                <w:szCs w:val="20"/>
-              </w:rPr>
-              <w:t>Faire</w:t>
-            </w:r>
-            <w:proofErr w:type="gramEnd"/>
-            <w:r>
-              <w:rPr>
-                <w:rFonts w:asciiTheme="majorHAnsi" w:hAnsiTheme="majorHAnsi" w:cstheme="majorHAnsi"/>
-                <w:sz w:val="20"/>
-                <w:szCs w:val="20"/>
-              </w:rPr>
-              <w:t xml:space="preserve"> un exercice en groupes : au vu du cas présenté, </w:t>
+            <w:r>
+              <w:rPr>
+                <w:rFonts w:asciiTheme="majorHAnsi" w:hAnsiTheme="majorHAnsi" w:cstheme="majorHAnsi"/>
+                <w:sz w:val="20"/>
+                <w:szCs w:val="20"/>
+              </w:rPr>
+              <w:t xml:space="preserve">Faire un exercice en groupes : au vu du cas présenté, </w:t>
             </w:r>
             <w:r>
               <w:rPr>
@@ -7023,23 +7011,13 @@
                 <w:szCs w:val="20"/>
               </w:rPr>
             </w:pPr>
-            <w:proofErr w:type="gramStart"/>
-            <w:r>
-              <w:rPr>
-                <w:rFonts w:asciiTheme="majorHAnsi" w:hAnsiTheme="majorHAnsi" w:cstheme="majorHAnsi"/>
-                <w:sz w:val="20"/>
-                <w:szCs w:val="20"/>
-              </w:rPr>
-              <w:t>Faire</w:t>
-            </w:r>
-            <w:proofErr w:type="gramEnd"/>
-            <w:r>
-              <w:rPr>
-                <w:rFonts w:asciiTheme="majorHAnsi" w:hAnsiTheme="majorHAnsi" w:cstheme="majorHAnsi"/>
-                <w:sz w:val="20"/>
-                <w:szCs w:val="20"/>
-              </w:rPr>
-              <w:t xml:space="preserve"> un exercice en groupes : au vu du cas présenté, </w:t>
+            <w:r>
+              <w:rPr>
+                <w:rFonts w:asciiTheme="majorHAnsi" w:hAnsiTheme="majorHAnsi" w:cstheme="majorHAnsi"/>
+                <w:sz w:val="20"/>
+                <w:szCs w:val="20"/>
+              </w:rPr>
+              <w:t xml:space="preserve">Faire un exercice en groupes : au vu du cas présenté, </w:t>
             </w:r>
             <w:r>
               <w:rPr>
@@ -7353,23 +7331,13 @@
                 <w:szCs w:val="20"/>
               </w:rPr>
             </w:pPr>
-            <w:proofErr w:type="gramStart"/>
-            <w:r>
-              <w:rPr>
-                <w:rFonts w:asciiTheme="majorHAnsi" w:hAnsiTheme="majorHAnsi" w:cstheme="majorHAnsi"/>
-                <w:sz w:val="20"/>
-                <w:szCs w:val="20"/>
-              </w:rPr>
-              <w:t>Faire</w:t>
-            </w:r>
-            <w:proofErr w:type="gramEnd"/>
-            <w:r>
-              <w:rPr>
-                <w:rFonts w:asciiTheme="majorHAnsi" w:hAnsiTheme="majorHAnsi" w:cstheme="majorHAnsi"/>
-                <w:sz w:val="20"/>
-                <w:szCs w:val="20"/>
-              </w:rPr>
-              <w:t xml:space="preserve"> un exercice personnel : choisissez et illustrez un objet d’étude</w:t>
+            <w:r>
+              <w:rPr>
+                <w:rFonts w:asciiTheme="majorHAnsi" w:hAnsiTheme="majorHAnsi" w:cstheme="majorHAnsi"/>
+                <w:sz w:val="20"/>
+                <w:szCs w:val="20"/>
+              </w:rPr>
+              <w:t>Faire un exercice personnel : choisissez et illustrez un objet d’étude</w:t>
             </w:r>
             <w:r>
               <w:rPr>
@@ -8464,23 +8432,13 @@
                 <w:szCs w:val="20"/>
               </w:rPr>
             </w:pPr>
-            <w:proofErr w:type="gramStart"/>
-            <w:r>
-              <w:rPr>
-                <w:rFonts w:asciiTheme="majorHAnsi" w:hAnsiTheme="majorHAnsi" w:cstheme="majorHAnsi"/>
-                <w:sz w:val="20"/>
-                <w:szCs w:val="20"/>
-              </w:rPr>
-              <w:t>Faire</w:t>
-            </w:r>
-            <w:proofErr w:type="gramEnd"/>
-            <w:r>
-              <w:rPr>
-                <w:rFonts w:asciiTheme="majorHAnsi" w:hAnsiTheme="majorHAnsi" w:cstheme="majorHAnsi"/>
-                <w:sz w:val="20"/>
-                <w:szCs w:val="20"/>
-              </w:rPr>
-              <w:t xml:space="preserve"> un exercice collégial : au vu du cas étudié, pour chaque élément fourni (PSSI, RGPD, </w:t>
+            <w:r>
+              <w:rPr>
+                <w:rFonts w:asciiTheme="majorHAnsi" w:hAnsiTheme="majorHAnsi" w:cstheme="majorHAnsi"/>
+                <w:sz w:val="20"/>
+                <w:szCs w:val="20"/>
+              </w:rPr>
+              <w:t xml:space="preserve">Faire un exercice collégial : au vu du cas étudié, pour chaque élément fourni (PSSI, RGPD, </w:t>
             </w:r>
             <w:r>
               <w:rPr>
@@ -8945,23 +8903,13 @@
                 <w:szCs w:val="20"/>
               </w:rPr>
             </w:pPr>
-            <w:proofErr w:type="gramStart"/>
-            <w:r>
-              <w:rPr>
-                <w:rFonts w:asciiTheme="majorHAnsi" w:hAnsiTheme="majorHAnsi" w:cstheme="majorHAnsi"/>
-                <w:sz w:val="20"/>
-                <w:szCs w:val="20"/>
-              </w:rPr>
-              <w:t>Faire</w:t>
-            </w:r>
-            <w:proofErr w:type="gramEnd"/>
-            <w:r>
-              <w:rPr>
-                <w:rFonts w:asciiTheme="majorHAnsi" w:hAnsiTheme="majorHAnsi" w:cstheme="majorHAnsi"/>
-                <w:sz w:val="20"/>
-                <w:szCs w:val="20"/>
-              </w:rPr>
-              <w:t xml:space="preserve"> un exercice collégial : au vu du cas étudié, quelles mesures pourrait-on préconiser </w:t>
+            <w:r>
+              <w:rPr>
+                <w:rFonts w:asciiTheme="majorHAnsi" w:hAnsiTheme="majorHAnsi" w:cstheme="majorHAnsi"/>
+                <w:sz w:val="20"/>
+                <w:szCs w:val="20"/>
+              </w:rPr>
+              <w:t xml:space="preserve">Faire un exercice collégial : au vu du cas étudié, quelles mesures pourrait-on préconiser </w:t>
             </w:r>
             <w:r>
               <w:rPr>
@@ -9003,7 +8951,6 @@
               </w:rPr>
               <w:t xml:space="preserve">[commencer une liste de mesures sur un </w:t>
             </w:r>
-            <w:proofErr w:type="spellStart"/>
             <w:r>
               <w:rPr>
                 <w:rFonts w:asciiTheme="majorHAnsi" w:hAnsiTheme="majorHAnsi" w:cstheme="majorHAnsi"/>
@@ -9012,31 +8959,8 @@
                 <w:sz w:val="20"/>
                 <w:szCs w:val="20"/>
               </w:rPr>
-              <w:t>paper</w:t>
-            </w:r>
-            <w:proofErr w:type="spellEnd"/>
-            <w:r>
-              <w:rPr>
-                <w:rFonts w:asciiTheme="majorHAnsi" w:hAnsiTheme="majorHAnsi" w:cstheme="majorHAnsi"/>
-                <w:i/>
-                <w:iCs/>
-                <w:sz w:val="20"/>
-                <w:szCs w:val="20"/>
-              </w:rPr>
-              <w:t xml:space="preserve"> </w:t>
-            </w:r>
-            <w:proofErr w:type="spellStart"/>
-            <w:r>
-              <w:rPr>
-                <w:rFonts w:asciiTheme="majorHAnsi" w:hAnsiTheme="majorHAnsi" w:cstheme="majorHAnsi"/>
-                <w:i/>
-                <w:iCs/>
-                <w:sz w:val="20"/>
-                <w:szCs w:val="20"/>
-              </w:rPr>
-              <w:t>board</w:t>
-            </w:r>
-            <w:proofErr w:type="spellEnd"/>
+              <w:t>paper board</w:t>
+            </w:r>
             <w:r>
               <w:rPr>
                 <w:rFonts w:asciiTheme="majorHAnsi" w:hAnsiTheme="majorHAnsi" w:cstheme="majorHAnsi"/>
@@ -9133,23 +9057,13 @@
                 <w:szCs w:val="20"/>
               </w:rPr>
             </w:pPr>
-            <w:proofErr w:type="gramStart"/>
-            <w:r>
-              <w:rPr>
-                <w:rFonts w:asciiTheme="majorHAnsi" w:hAnsiTheme="majorHAnsi" w:cstheme="majorHAnsi"/>
-                <w:sz w:val="20"/>
-                <w:szCs w:val="20"/>
-              </w:rPr>
-              <w:t>Faire</w:t>
-            </w:r>
-            <w:proofErr w:type="gramEnd"/>
-            <w:r>
-              <w:rPr>
-                <w:rFonts w:asciiTheme="majorHAnsi" w:hAnsiTheme="majorHAnsi" w:cstheme="majorHAnsi"/>
-                <w:sz w:val="20"/>
-                <w:szCs w:val="20"/>
-              </w:rPr>
-              <w:t xml:space="preserve"> un exercice personnel : choisissez et </w:t>
+            <w:r>
+              <w:rPr>
+                <w:rFonts w:asciiTheme="majorHAnsi" w:hAnsiTheme="majorHAnsi" w:cstheme="majorHAnsi"/>
+                <w:sz w:val="20"/>
+                <w:szCs w:val="20"/>
+              </w:rPr>
+              <w:t xml:space="preserve">Faire un exercice personnel : choisissez et </w:t>
             </w:r>
             <w:r>
               <w:rPr>
@@ -9302,7 +9216,31 @@
               <w:rPr>
                 <w:rFonts w:cstheme="majorHAnsi"/>
               </w:rPr>
-              <w:t xml:space="preserve"> (jour 1 après-midi)</w:t>
+              <w:t xml:space="preserve"> (jour </w:t>
+            </w:r>
+            <w:r>
+              <w:rPr>
+                <w:rFonts w:cstheme="majorHAnsi"/>
+              </w:rPr>
+              <w:t>1</w:t>
+            </w:r>
+            <w:r>
+              <w:rPr>
+                <w:rFonts w:cstheme="majorHAnsi"/>
+              </w:rPr>
+              <w:t xml:space="preserve"> après-midi et jour </w:t>
+            </w:r>
+            <w:r>
+              <w:rPr>
+                <w:rFonts w:cstheme="majorHAnsi"/>
+              </w:rPr>
+              <w:t>2 matin</w:t>
+            </w:r>
+            <w:r>
+              <w:rPr>
+                <w:rFonts w:cstheme="majorHAnsi"/>
+              </w:rPr>
+              <w:t>)</w:t>
             </w:r>
             <w:bookmarkEnd w:id="14"/>
           </w:p>
@@ -9956,23 +9894,13 @@
                 <w:szCs w:val="20"/>
               </w:rPr>
             </w:pPr>
-            <w:proofErr w:type="gramStart"/>
-            <w:r>
-              <w:rPr>
-                <w:rFonts w:asciiTheme="majorHAnsi" w:hAnsiTheme="majorHAnsi" w:cstheme="majorHAnsi"/>
-                <w:sz w:val="20"/>
-                <w:szCs w:val="20"/>
-              </w:rPr>
-              <w:t>Faire</w:t>
-            </w:r>
-            <w:proofErr w:type="gramEnd"/>
-            <w:r>
-              <w:rPr>
-                <w:rFonts w:asciiTheme="majorHAnsi" w:hAnsiTheme="majorHAnsi" w:cstheme="majorHAnsi"/>
-                <w:sz w:val="20"/>
-                <w:szCs w:val="20"/>
-              </w:rPr>
-              <w:t xml:space="preserve"> un exercice en groupes : au vu du cas étudié</w:t>
+            <w:r>
+              <w:rPr>
+                <w:rFonts w:asciiTheme="majorHAnsi" w:hAnsiTheme="majorHAnsi" w:cstheme="majorHAnsi"/>
+                <w:sz w:val="20"/>
+                <w:szCs w:val="20"/>
+              </w:rPr>
+              <w:t>Faire un exercice en groupes : au vu du cas étudié</w:t>
             </w:r>
             <w:r>
               <w:rPr>
@@ -10191,16 +10119,8 @@
                 <w:sz w:val="20"/>
                 <w:szCs w:val="20"/>
               </w:rPr>
-              <w:t xml:space="preserve">Le traitement des risques liés aux </w:t>
-            </w:r>
-            <w:r>
-              <w:rPr>
-                <w:rFonts w:asciiTheme="majorHAnsi" w:hAnsiTheme="majorHAnsi" w:cstheme="majorHAnsi"/>
-                <w:sz w:val="20"/>
-                <w:szCs w:val="20"/>
-              </w:rPr>
               <w:lastRenderedPageBreak/>
-              <w:t>événements redoutés</w:t>
+              <w:t>Le traitement des risques liés aux événements redoutés</w:t>
             </w:r>
           </w:p>
         </w:tc>
@@ -10223,7 +10143,6 @@
                 <w:sz w:val="20"/>
                 <w:szCs w:val="20"/>
               </w:rPr>
-              <w:lastRenderedPageBreak/>
               <w:t>Faire comprendre qu’on peut déjà déterminer des mesures complémentaires au socle</w:t>
             </w:r>
           </w:p>
@@ -10312,24 +10231,13 @@
                 <w:szCs w:val="20"/>
               </w:rPr>
             </w:pPr>
-            <w:proofErr w:type="gramStart"/>
-            <w:r>
-              <w:rPr>
-                <w:rFonts w:asciiTheme="majorHAnsi" w:hAnsiTheme="majorHAnsi" w:cstheme="majorHAnsi"/>
-                <w:sz w:val="20"/>
-                <w:szCs w:val="20"/>
-              </w:rPr>
-              <w:lastRenderedPageBreak/>
-              <w:t>Faire</w:t>
-            </w:r>
-            <w:proofErr w:type="gramEnd"/>
-            <w:r>
-              <w:rPr>
-                <w:rFonts w:asciiTheme="majorHAnsi" w:hAnsiTheme="majorHAnsi" w:cstheme="majorHAnsi"/>
-                <w:sz w:val="20"/>
-                <w:szCs w:val="20"/>
-              </w:rPr>
-              <w:t xml:space="preserve"> un exercice collégial : au vu du cas étudié, quelles mesures pourrait-on préconiser </w:t>
+            <w:r>
+              <w:rPr>
+                <w:rFonts w:asciiTheme="majorHAnsi" w:hAnsiTheme="majorHAnsi" w:cstheme="majorHAnsi"/>
+                <w:sz w:val="20"/>
+                <w:szCs w:val="20"/>
+              </w:rPr>
+              <w:t xml:space="preserve">Faire un exercice collégial : au vu du cas étudié, quelles mesures pourrait-on préconiser </w:t>
             </w:r>
             <w:r>
               <w:rPr>
@@ -10403,7 +10311,6 @@
               </w:rPr>
               <w:t xml:space="preserve"> </w:t>
             </w:r>
-            <w:proofErr w:type="spellStart"/>
             <w:r>
               <w:rPr>
                 <w:rFonts w:asciiTheme="majorHAnsi" w:hAnsiTheme="majorHAnsi" w:cstheme="majorHAnsi"/>
@@ -10412,31 +10319,8 @@
                 <w:sz w:val="20"/>
                 <w:szCs w:val="20"/>
               </w:rPr>
-              <w:t>paper</w:t>
-            </w:r>
-            <w:proofErr w:type="spellEnd"/>
-            <w:r>
-              <w:rPr>
-                <w:rFonts w:asciiTheme="majorHAnsi" w:hAnsiTheme="majorHAnsi" w:cstheme="majorHAnsi"/>
-                <w:i/>
-                <w:iCs/>
-                <w:sz w:val="20"/>
-                <w:szCs w:val="20"/>
-              </w:rPr>
-              <w:t xml:space="preserve"> </w:t>
-            </w:r>
-            <w:proofErr w:type="spellStart"/>
-            <w:r>
-              <w:rPr>
-                <w:rFonts w:asciiTheme="majorHAnsi" w:hAnsiTheme="majorHAnsi" w:cstheme="majorHAnsi"/>
-                <w:i/>
-                <w:iCs/>
-                <w:sz w:val="20"/>
-                <w:szCs w:val="20"/>
-              </w:rPr>
-              <w:t>board</w:t>
-            </w:r>
-            <w:proofErr w:type="spellEnd"/>
+              <w:t>paper board</w:t>
+            </w:r>
             <w:r>
               <w:rPr>
                 <w:rFonts w:asciiTheme="majorHAnsi" w:hAnsiTheme="majorHAnsi" w:cstheme="majorHAnsi"/>
@@ -10477,7 +10361,6 @@
                 <w:sz w:val="20"/>
                 <w:szCs w:val="20"/>
               </w:rPr>
-              <w:lastRenderedPageBreak/>
               <w:t>L’outil 07 : analys</w:t>
             </w:r>
             <w:r>
@@ -10648,23 +10531,13 @@
                 <w:szCs w:val="20"/>
               </w:rPr>
             </w:pPr>
-            <w:proofErr w:type="gramStart"/>
-            <w:r>
-              <w:rPr>
-                <w:rFonts w:asciiTheme="majorHAnsi" w:hAnsiTheme="majorHAnsi" w:cstheme="majorHAnsi"/>
-                <w:sz w:val="20"/>
-                <w:szCs w:val="20"/>
-              </w:rPr>
-              <w:t>Faire</w:t>
-            </w:r>
-            <w:proofErr w:type="gramEnd"/>
-            <w:r>
-              <w:rPr>
-                <w:rFonts w:asciiTheme="majorHAnsi" w:hAnsiTheme="majorHAnsi" w:cstheme="majorHAnsi"/>
-                <w:sz w:val="20"/>
-                <w:szCs w:val="20"/>
-              </w:rPr>
-              <w:t xml:space="preserve"> un exercice </w:t>
+            <w:r>
+              <w:rPr>
+                <w:rFonts w:asciiTheme="majorHAnsi" w:hAnsiTheme="majorHAnsi" w:cstheme="majorHAnsi"/>
+                <w:sz w:val="20"/>
+                <w:szCs w:val="20"/>
+              </w:rPr>
+              <w:t xml:space="preserve">Faire un exercice </w:t>
             </w:r>
             <w:r>
               <w:rPr>
@@ -10965,23 +10838,13 @@
                 <w:szCs w:val="20"/>
               </w:rPr>
             </w:pPr>
-            <w:proofErr w:type="gramStart"/>
-            <w:r>
-              <w:rPr>
-                <w:rFonts w:asciiTheme="majorHAnsi" w:hAnsiTheme="majorHAnsi" w:cstheme="majorHAnsi"/>
-                <w:sz w:val="20"/>
-                <w:szCs w:val="20"/>
-              </w:rPr>
-              <w:t>Faire</w:t>
-            </w:r>
-            <w:proofErr w:type="gramEnd"/>
-            <w:r>
-              <w:rPr>
-                <w:rFonts w:asciiTheme="majorHAnsi" w:hAnsiTheme="majorHAnsi" w:cstheme="majorHAnsi"/>
-                <w:sz w:val="20"/>
-                <w:szCs w:val="20"/>
-              </w:rPr>
-              <w:t xml:space="preserve"> un exercice </w:t>
+            <w:r>
+              <w:rPr>
+                <w:rFonts w:asciiTheme="majorHAnsi" w:hAnsiTheme="majorHAnsi" w:cstheme="majorHAnsi"/>
+                <w:sz w:val="20"/>
+                <w:szCs w:val="20"/>
+              </w:rPr>
+              <w:t xml:space="preserve">Faire un exercice </w:t>
             </w:r>
             <w:r>
               <w:rPr>
@@ -11383,23 +11246,13 @@
                 <w:szCs w:val="20"/>
               </w:rPr>
             </w:pPr>
-            <w:proofErr w:type="gramStart"/>
-            <w:r>
-              <w:rPr>
-                <w:rFonts w:asciiTheme="majorHAnsi" w:hAnsiTheme="majorHAnsi" w:cstheme="majorHAnsi"/>
-                <w:sz w:val="20"/>
-                <w:szCs w:val="20"/>
-              </w:rPr>
-              <w:t>Faire</w:t>
-            </w:r>
-            <w:proofErr w:type="gramEnd"/>
-            <w:r>
-              <w:rPr>
-                <w:rFonts w:asciiTheme="majorHAnsi" w:hAnsiTheme="majorHAnsi" w:cstheme="majorHAnsi"/>
-                <w:sz w:val="20"/>
-                <w:szCs w:val="20"/>
-              </w:rPr>
-              <w:t xml:space="preserve"> un exercice collégial : au vu du cas étudié, quelles mesures pourrait-on préconiser </w:t>
+            <w:r>
+              <w:rPr>
+                <w:rFonts w:asciiTheme="majorHAnsi" w:hAnsiTheme="majorHAnsi" w:cstheme="majorHAnsi"/>
+                <w:sz w:val="20"/>
+                <w:szCs w:val="20"/>
+              </w:rPr>
+              <w:t xml:space="preserve">Faire un exercice collégial : au vu du cas étudié, quelles mesures pourrait-on préconiser </w:t>
             </w:r>
             <w:r>
               <w:rPr>
@@ -11473,7 +11326,6 @@
               </w:rPr>
               <w:t xml:space="preserve"> </w:t>
             </w:r>
-            <w:proofErr w:type="spellStart"/>
             <w:r>
               <w:rPr>
                 <w:rFonts w:asciiTheme="majorHAnsi" w:hAnsiTheme="majorHAnsi" w:cstheme="majorHAnsi"/>
@@ -11482,31 +11334,8 @@
                 <w:sz w:val="20"/>
                 <w:szCs w:val="20"/>
               </w:rPr>
-              <w:t>paper</w:t>
-            </w:r>
-            <w:proofErr w:type="spellEnd"/>
-            <w:r>
-              <w:rPr>
-                <w:rFonts w:asciiTheme="majorHAnsi" w:hAnsiTheme="majorHAnsi" w:cstheme="majorHAnsi"/>
-                <w:i/>
-                <w:iCs/>
-                <w:sz w:val="20"/>
-                <w:szCs w:val="20"/>
-              </w:rPr>
-              <w:t xml:space="preserve"> </w:t>
-            </w:r>
-            <w:proofErr w:type="spellStart"/>
-            <w:r>
-              <w:rPr>
-                <w:rFonts w:asciiTheme="majorHAnsi" w:hAnsiTheme="majorHAnsi" w:cstheme="majorHAnsi"/>
-                <w:i/>
-                <w:iCs/>
-                <w:sz w:val="20"/>
-                <w:szCs w:val="20"/>
-              </w:rPr>
-              <w:t>board</w:t>
-            </w:r>
-            <w:proofErr w:type="spellEnd"/>
+              <w:t>paper board</w:t>
+            </w:r>
             <w:r>
               <w:rPr>
                 <w:rFonts w:asciiTheme="majorHAnsi" w:hAnsiTheme="majorHAnsi" w:cstheme="majorHAnsi"/>
@@ -11798,23 +11627,13 @@
                 <w:szCs w:val="20"/>
               </w:rPr>
             </w:pPr>
-            <w:proofErr w:type="gramStart"/>
-            <w:r>
-              <w:rPr>
-                <w:rFonts w:asciiTheme="majorHAnsi" w:hAnsiTheme="majorHAnsi" w:cstheme="majorHAnsi"/>
-                <w:sz w:val="20"/>
-                <w:szCs w:val="20"/>
-              </w:rPr>
-              <w:t>Faire</w:t>
-            </w:r>
-            <w:proofErr w:type="gramEnd"/>
-            <w:r>
-              <w:rPr>
-                <w:rFonts w:asciiTheme="majorHAnsi" w:hAnsiTheme="majorHAnsi" w:cstheme="majorHAnsi"/>
-                <w:sz w:val="20"/>
-                <w:szCs w:val="20"/>
-              </w:rPr>
-              <w:t xml:space="preserve"> un exercice </w:t>
+            <w:r>
+              <w:rPr>
+                <w:rFonts w:asciiTheme="majorHAnsi" w:hAnsiTheme="majorHAnsi" w:cstheme="majorHAnsi"/>
+                <w:sz w:val="20"/>
+                <w:szCs w:val="20"/>
+              </w:rPr>
+              <w:t xml:space="preserve">Faire un exercice </w:t>
             </w:r>
             <w:r>
               <w:rPr>
@@ -12009,7 +11828,16 @@
                 <w:sz w:val="20"/>
                 <w:szCs w:val="20"/>
               </w:rPr>
-              <w:t>L’outil 09 : analyser les s</w:t>
+              <w:t xml:space="preserve">L’outil 09 : analyser les </w:t>
+            </w:r>
+            <w:r>
+              <w:rPr>
+                <w:rFonts w:asciiTheme="majorHAnsi" w:hAnsiTheme="majorHAnsi" w:cstheme="majorHAnsi"/>
+                <w:sz w:val="20"/>
+                <w:szCs w:val="20"/>
+              </w:rPr>
+              <w:lastRenderedPageBreak/>
+              <w:t>s</w:t>
             </w:r>
             <w:r>
               <w:rPr>
@@ -12040,6 +11868,7 @@
                 <w:sz w:val="20"/>
                 <w:szCs w:val="20"/>
               </w:rPr>
+              <w:lastRenderedPageBreak/>
               <w:t>Expliquer comment créer des scénarios stratégiques</w:t>
             </w:r>
           </w:p>
@@ -12118,6 +11947,7 @@
                 <w:sz w:val="20"/>
                 <w:szCs w:val="20"/>
               </w:rPr>
+              <w:lastRenderedPageBreak/>
               <w:t>[diapositive</w:t>
             </w:r>
             <w:r>
@@ -12160,7 +11990,6 @@
                 <w:szCs w:val="20"/>
                 <w:u w:val="single"/>
               </w:rPr>
-              <w:lastRenderedPageBreak/>
               <w:t>Principal message</w:t>
             </w:r>
             <w:r>
@@ -12188,23 +12017,13 @@
                 <w:szCs w:val="20"/>
               </w:rPr>
             </w:pPr>
-            <w:proofErr w:type="gramStart"/>
-            <w:r>
-              <w:rPr>
-                <w:rFonts w:asciiTheme="majorHAnsi" w:hAnsiTheme="majorHAnsi" w:cstheme="majorHAnsi"/>
-                <w:sz w:val="20"/>
-                <w:szCs w:val="20"/>
-              </w:rPr>
-              <w:t>Faire</w:t>
-            </w:r>
-            <w:proofErr w:type="gramEnd"/>
-            <w:r>
-              <w:rPr>
-                <w:rFonts w:asciiTheme="majorHAnsi" w:hAnsiTheme="majorHAnsi" w:cstheme="majorHAnsi"/>
-                <w:sz w:val="20"/>
-                <w:szCs w:val="20"/>
-              </w:rPr>
-              <w:t xml:space="preserve"> un exercice collégial : au vu du cas étudié, identifiez et représentez les chemins d’attaques possibles pour un couple SR/OV</w:t>
+            <w:r>
+              <w:rPr>
+                <w:rFonts w:asciiTheme="majorHAnsi" w:hAnsiTheme="majorHAnsi" w:cstheme="majorHAnsi"/>
+                <w:sz w:val="20"/>
+                <w:szCs w:val="20"/>
+              </w:rPr>
+              <w:t>Faire un exercice collégial : au vu du cas étudié, identifiez et représentez les chemins d’attaques possibles pour un couple SR/OV</w:t>
             </w:r>
           </w:p>
           <w:p>
@@ -12471,23 +12290,13 @@
                 <w:szCs w:val="20"/>
               </w:rPr>
             </w:pPr>
-            <w:proofErr w:type="gramStart"/>
-            <w:r>
-              <w:rPr>
-                <w:rFonts w:asciiTheme="majorHAnsi" w:hAnsiTheme="majorHAnsi" w:cstheme="majorHAnsi"/>
-                <w:sz w:val="20"/>
-                <w:szCs w:val="20"/>
-              </w:rPr>
-              <w:t>Faire</w:t>
-            </w:r>
-            <w:proofErr w:type="gramEnd"/>
-            <w:r>
-              <w:rPr>
-                <w:rFonts w:asciiTheme="majorHAnsi" w:hAnsiTheme="majorHAnsi" w:cstheme="majorHAnsi"/>
-                <w:sz w:val="20"/>
-                <w:szCs w:val="20"/>
-              </w:rPr>
-              <w:t xml:space="preserve"> un exercice collégial : au vu du cas étudié, quelles mesures pourrait-on préconiser </w:t>
+            <w:r>
+              <w:rPr>
+                <w:rFonts w:asciiTheme="majorHAnsi" w:hAnsiTheme="majorHAnsi" w:cstheme="majorHAnsi"/>
+                <w:sz w:val="20"/>
+                <w:szCs w:val="20"/>
+              </w:rPr>
+              <w:t xml:space="preserve">Faire un exercice collégial : au vu du cas étudié, quelles mesures pourrait-on préconiser </w:t>
             </w:r>
             <w:r>
               <w:rPr>
@@ -12561,7 +12370,6 @@
               </w:rPr>
               <w:t xml:space="preserve"> </w:t>
             </w:r>
-            <w:proofErr w:type="spellStart"/>
             <w:r>
               <w:rPr>
                 <w:rFonts w:asciiTheme="majorHAnsi" w:hAnsiTheme="majorHAnsi" w:cstheme="majorHAnsi"/>
@@ -12570,31 +12378,8 @@
                 <w:sz w:val="20"/>
                 <w:szCs w:val="20"/>
               </w:rPr>
-              <w:t>paper</w:t>
-            </w:r>
-            <w:proofErr w:type="spellEnd"/>
-            <w:r>
-              <w:rPr>
-                <w:rFonts w:asciiTheme="majorHAnsi" w:hAnsiTheme="majorHAnsi" w:cstheme="majorHAnsi"/>
-                <w:i/>
-                <w:iCs/>
-                <w:sz w:val="20"/>
-                <w:szCs w:val="20"/>
-              </w:rPr>
-              <w:t xml:space="preserve"> </w:t>
-            </w:r>
-            <w:proofErr w:type="spellStart"/>
-            <w:r>
-              <w:rPr>
-                <w:rFonts w:asciiTheme="majorHAnsi" w:hAnsiTheme="majorHAnsi" w:cstheme="majorHAnsi"/>
-                <w:i/>
-                <w:iCs/>
-                <w:sz w:val="20"/>
-                <w:szCs w:val="20"/>
-              </w:rPr>
-              <w:t>board</w:t>
-            </w:r>
-            <w:proofErr w:type="spellEnd"/>
+              <w:t>paper board</w:t>
+            </w:r>
             <w:r>
               <w:rPr>
                 <w:rFonts w:asciiTheme="majorHAnsi" w:hAnsiTheme="majorHAnsi" w:cstheme="majorHAnsi"/>
@@ -12823,23 +12608,13 @@
                 <w:szCs w:val="20"/>
               </w:rPr>
             </w:pPr>
-            <w:proofErr w:type="gramStart"/>
-            <w:r>
-              <w:rPr>
-                <w:rFonts w:asciiTheme="majorHAnsi" w:hAnsiTheme="majorHAnsi" w:cstheme="majorHAnsi"/>
-                <w:sz w:val="20"/>
-                <w:szCs w:val="20"/>
-              </w:rPr>
-              <w:t>Faire</w:t>
-            </w:r>
-            <w:proofErr w:type="gramEnd"/>
-            <w:r>
-              <w:rPr>
-                <w:rFonts w:asciiTheme="majorHAnsi" w:hAnsiTheme="majorHAnsi" w:cstheme="majorHAnsi"/>
-                <w:sz w:val="20"/>
-                <w:szCs w:val="20"/>
-              </w:rPr>
-              <w:t xml:space="preserve"> un exercice en groupes : au vu du cas présenté, imaginez un ou plusieurs scénarios opérationnels permettant de mettre en œuvre l’un des chemins d’attaques d’un scénario stratégique</w:t>
+            <w:r>
+              <w:rPr>
+                <w:rFonts w:asciiTheme="majorHAnsi" w:hAnsiTheme="majorHAnsi" w:cstheme="majorHAnsi"/>
+                <w:sz w:val="20"/>
+                <w:szCs w:val="20"/>
+              </w:rPr>
+              <w:t>Faire un exercice en groupes : au vu du cas présenté, imaginez un ou plusieurs scénarios opérationnels permettant de mettre en œuvre l’un des chemins d’attaques d’un scénario stratégique</w:t>
             </w:r>
           </w:p>
           <w:p>
@@ -13098,23 +12873,13 @@
                 <w:szCs w:val="20"/>
               </w:rPr>
             </w:pPr>
-            <w:proofErr w:type="gramStart"/>
-            <w:r>
-              <w:rPr>
-                <w:rFonts w:asciiTheme="majorHAnsi" w:hAnsiTheme="majorHAnsi" w:cstheme="majorHAnsi"/>
-                <w:sz w:val="20"/>
-                <w:szCs w:val="20"/>
-              </w:rPr>
-              <w:t>Faire</w:t>
-            </w:r>
-            <w:proofErr w:type="gramEnd"/>
-            <w:r>
-              <w:rPr>
-                <w:rFonts w:asciiTheme="majorHAnsi" w:hAnsiTheme="majorHAnsi" w:cstheme="majorHAnsi"/>
-                <w:sz w:val="20"/>
-                <w:szCs w:val="20"/>
-              </w:rPr>
-              <w:t xml:space="preserve"> un exercice collégial : au vu du cas étudié, quelles mesures pourrait-on préconiser </w:t>
+            <w:r>
+              <w:rPr>
+                <w:rFonts w:asciiTheme="majorHAnsi" w:hAnsiTheme="majorHAnsi" w:cstheme="majorHAnsi"/>
+                <w:sz w:val="20"/>
+                <w:szCs w:val="20"/>
+              </w:rPr>
+              <w:t xml:space="preserve">Faire un exercice collégial : au vu du cas étudié, quelles mesures pourrait-on préconiser </w:t>
             </w:r>
             <w:r>
               <w:rPr>
@@ -13188,7 +12953,6 @@
               </w:rPr>
               <w:t xml:space="preserve"> </w:t>
             </w:r>
-            <w:proofErr w:type="spellStart"/>
             <w:r>
               <w:rPr>
                 <w:rFonts w:asciiTheme="majorHAnsi" w:hAnsiTheme="majorHAnsi" w:cstheme="majorHAnsi"/>
@@ -13197,31 +12961,8 @@
                 <w:sz w:val="20"/>
                 <w:szCs w:val="20"/>
               </w:rPr>
-              <w:t>paper</w:t>
-            </w:r>
-            <w:proofErr w:type="spellEnd"/>
-            <w:r>
-              <w:rPr>
-                <w:rFonts w:asciiTheme="majorHAnsi" w:hAnsiTheme="majorHAnsi" w:cstheme="majorHAnsi"/>
-                <w:i/>
-                <w:iCs/>
-                <w:sz w:val="20"/>
-                <w:szCs w:val="20"/>
-              </w:rPr>
-              <w:t xml:space="preserve"> </w:t>
-            </w:r>
-            <w:proofErr w:type="spellStart"/>
-            <w:r>
-              <w:rPr>
-                <w:rFonts w:asciiTheme="majorHAnsi" w:hAnsiTheme="majorHAnsi" w:cstheme="majorHAnsi"/>
-                <w:i/>
-                <w:iCs/>
-                <w:sz w:val="20"/>
-                <w:szCs w:val="20"/>
-              </w:rPr>
-              <w:t>board</w:t>
-            </w:r>
-            <w:proofErr w:type="spellEnd"/>
+              <w:t>paper board</w:t>
+            </w:r>
             <w:r>
               <w:rPr>
                 <w:rFonts w:asciiTheme="majorHAnsi" w:hAnsiTheme="majorHAnsi" w:cstheme="majorHAnsi"/>
@@ -13570,23 +13311,13 @@
                 <w:szCs w:val="20"/>
               </w:rPr>
             </w:pPr>
-            <w:proofErr w:type="gramStart"/>
-            <w:r>
-              <w:rPr>
-                <w:rFonts w:asciiTheme="majorHAnsi" w:hAnsiTheme="majorHAnsi" w:cstheme="majorHAnsi"/>
-                <w:sz w:val="20"/>
-                <w:szCs w:val="20"/>
-              </w:rPr>
-              <w:t>Faire</w:t>
-            </w:r>
-            <w:proofErr w:type="gramEnd"/>
-            <w:r>
-              <w:rPr>
-                <w:rFonts w:asciiTheme="majorHAnsi" w:hAnsiTheme="majorHAnsi" w:cstheme="majorHAnsi"/>
-                <w:sz w:val="20"/>
-                <w:szCs w:val="20"/>
-              </w:rPr>
-              <w:t xml:space="preserve"> un exercice personnel : </w:t>
+            <w:r>
+              <w:rPr>
+                <w:rFonts w:asciiTheme="majorHAnsi" w:hAnsiTheme="majorHAnsi" w:cstheme="majorHAnsi"/>
+                <w:sz w:val="20"/>
+                <w:szCs w:val="20"/>
+              </w:rPr>
+              <w:t xml:space="preserve">Faire un exercice personnel : </w:t>
             </w:r>
             <w:r>
               <w:rPr>
@@ -13716,6 +13447,7 @@
           <w:p>
             <w:pPr>
               <w:pStyle w:val="Titre2"/>
+              <w:pageBreakBefore/>
               <w:rPr>
                 <w:rFonts w:cstheme="majorHAnsi"/>
               </w:rPr>
@@ -13725,13 +13457,26 @@
               <w:rPr>
                 <w:rFonts w:cstheme="majorHAnsi"/>
               </w:rPr>
+              <w:lastRenderedPageBreak/>
               <w:t>Traitement des risques</w:t>
             </w:r>
             <w:r>
               <w:rPr>
                 <w:rFonts w:cstheme="majorHAnsi"/>
               </w:rPr>
-              <w:t xml:space="preserve"> (jour 1 après-midi)</w:t>
+              <w:t xml:space="preserve"> (jour </w:t>
+            </w:r>
+            <w:r>
+              <w:rPr>
+                <w:rFonts w:cstheme="majorHAnsi"/>
+              </w:rPr>
+              <w:t>2 matin</w:t>
+            </w:r>
+            <w:r>
+              <w:rPr>
+                <w:rFonts w:cstheme="majorHAnsi"/>
+              </w:rPr>
+              <w:t>)</w:t>
             </w:r>
             <w:bookmarkEnd w:id="15"/>
           </w:p>
@@ -14007,7 +13752,6 @@
                 <w:szCs w:val="20"/>
                 <w:u w:val="single"/>
               </w:rPr>
-              <w:lastRenderedPageBreak/>
               <w:t>Principal message</w:t>
             </w:r>
             <w:r>
@@ -14070,7 +13814,6 @@
                 <w:sz w:val="20"/>
                 <w:szCs w:val="20"/>
               </w:rPr>
-              <w:lastRenderedPageBreak/>
               <w:t>L’outil 13 : déterminer les mesures</w:t>
             </w:r>
           </w:p>
@@ -14260,7 +14003,6 @@
                 <w:szCs w:val="20"/>
               </w:rPr>
             </w:pPr>
-            <w:proofErr w:type="gramStart"/>
             <w:r>
               <w:rPr>
                 <w:rFonts w:asciiTheme="majorHAnsi" w:hAnsiTheme="majorHAnsi" w:cstheme="majorHAnsi"/>
@@ -14268,9 +14010,8 @@
                 <w:sz w:val="20"/>
                 <w:szCs w:val="20"/>
               </w:rPr>
-              <w:t>Faire</w:t>
-            </w:r>
-            <w:proofErr w:type="gramEnd"/>
+              <w:t xml:space="preserve">Faire un exercice collégial : priorisez les mesures identifiées dans les </w:t>
+            </w:r>
             <w:r>
               <w:rPr>
                 <w:rFonts w:asciiTheme="majorHAnsi" w:hAnsiTheme="majorHAnsi" w:cstheme="majorHAnsi"/>
@@ -14278,7 +14019,7 @@
                 <w:sz w:val="20"/>
                 <w:szCs w:val="20"/>
               </w:rPr>
-              <w:t xml:space="preserve"> un exercice collégial : priorisez les mesures identifiées dans les </w:t>
+              <w:t>étapes</w:t>
             </w:r>
             <w:r>
               <w:rPr>
@@ -14287,7 +14028,7 @@
                 <w:sz w:val="20"/>
                 <w:szCs w:val="20"/>
               </w:rPr>
-              <w:t>étapes</w:t>
+              <w:t xml:space="preserve"> précédent</w:t>
             </w:r>
             <w:r>
               <w:rPr>
@@ -14296,7 +14037,7 @@
                 <w:sz w:val="20"/>
                 <w:szCs w:val="20"/>
               </w:rPr>
-              <w:t xml:space="preserve"> précédent</w:t>
+              <w:t>e</w:t>
             </w:r>
             <w:r>
               <w:rPr>
@@ -14305,15 +14046,6 @@
                 <w:sz w:val="20"/>
                 <w:szCs w:val="20"/>
               </w:rPr>
-              <w:t>e</w:t>
-            </w:r>
-            <w:r>
-              <w:rPr>
-                <w:rFonts w:asciiTheme="majorHAnsi" w:hAnsiTheme="majorHAnsi" w:cstheme="majorHAnsi"/>
-                <w:iCs/>
-                <w:sz w:val="20"/>
-                <w:szCs w:val="20"/>
-              </w:rPr>
               <w:t>s et justifiez</w:t>
             </w:r>
           </w:p>
@@ -14340,7 +14072,6 @@
               </w:rPr>
               <w:t xml:space="preserve">[liste de mesures notées sur le </w:t>
             </w:r>
-            <w:proofErr w:type="spellStart"/>
             <w:r>
               <w:rPr>
                 <w:rFonts w:asciiTheme="majorHAnsi" w:hAnsiTheme="majorHAnsi" w:cstheme="majorHAnsi"/>
@@ -14349,31 +14080,8 @@
                 <w:sz w:val="20"/>
                 <w:szCs w:val="20"/>
               </w:rPr>
-              <w:t>paper</w:t>
-            </w:r>
-            <w:proofErr w:type="spellEnd"/>
-            <w:r>
-              <w:rPr>
-                <w:rFonts w:asciiTheme="majorHAnsi" w:hAnsiTheme="majorHAnsi" w:cstheme="majorHAnsi"/>
-                <w:i/>
-                <w:iCs/>
-                <w:sz w:val="20"/>
-                <w:szCs w:val="20"/>
-              </w:rPr>
-              <w:t xml:space="preserve"> </w:t>
-            </w:r>
-            <w:proofErr w:type="spellStart"/>
-            <w:r>
-              <w:rPr>
-                <w:rFonts w:asciiTheme="majorHAnsi" w:hAnsiTheme="majorHAnsi" w:cstheme="majorHAnsi"/>
-                <w:i/>
-                <w:iCs/>
-                <w:sz w:val="20"/>
-                <w:szCs w:val="20"/>
-              </w:rPr>
-              <w:t>board</w:t>
-            </w:r>
-            <w:proofErr w:type="spellEnd"/>
+              <w:t>paper board</w:t>
+            </w:r>
             <w:r>
               <w:rPr>
                 <w:rFonts w:asciiTheme="majorHAnsi" w:hAnsiTheme="majorHAnsi" w:cstheme="majorHAnsi"/>
@@ -14500,25 +14208,7 @@
                 <w:sz w:val="20"/>
                 <w:szCs w:val="20"/>
               </w:rPr>
-              <w:t xml:space="preserve">, et comment </w:t>
-            </w:r>
-            <w:proofErr w:type="spellStart"/>
-            <w:r>
-              <w:rPr>
-                <w:rFonts w:asciiTheme="majorHAnsi" w:hAnsiTheme="majorHAnsi" w:cstheme="majorHAnsi"/>
-                <w:sz w:val="20"/>
-                <w:szCs w:val="20"/>
-              </w:rPr>
-              <w:t>ré-estimer</w:t>
-            </w:r>
-            <w:proofErr w:type="spellEnd"/>
-            <w:r>
-              <w:rPr>
-                <w:rFonts w:asciiTheme="majorHAnsi" w:hAnsiTheme="majorHAnsi" w:cstheme="majorHAnsi"/>
-                <w:sz w:val="20"/>
-                <w:szCs w:val="20"/>
-              </w:rPr>
-              <w:t xml:space="preserve"> les risques et faire décider de leur acceptation</w:t>
+              <w:t>, et comment ré-estimer les risques et faire décider de leur acceptation</w:t>
             </w:r>
           </w:p>
           <w:p>
@@ -15001,23 +14691,13 @@
                 <w:szCs w:val="20"/>
               </w:rPr>
             </w:pPr>
-            <w:proofErr w:type="gramStart"/>
-            <w:r>
-              <w:rPr>
-                <w:rFonts w:asciiTheme="majorHAnsi" w:hAnsiTheme="majorHAnsi" w:cstheme="majorHAnsi"/>
-                <w:sz w:val="20"/>
-                <w:szCs w:val="20"/>
-              </w:rPr>
-              <w:t>Faire</w:t>
-            </w:r>
-            <w:proofErr w:type="gramEnd"/>
-            <w:r>
-              <w:rPr>
-                <w:rFonts w:asciiTheme="majorHAnsi" w:hAnsiTheme="majorHAnsi" w:cstheme="majorHAnsi"/>
-                <w:sz w:val="20"/>
-                <w:szCs w:val="20"/>
-              </w:rPr>
-              <w:t xml:space="preserve"> un exercice personnel : </w:t>
+            <w:r>
+              <w:rPr>
+                <w:rFonts w:asciiTheme="majorHAnsi" w:hAnsiTheme="majorHAnsi" w:cstheme="majorHAnsi"/>
+                <w:sz w:val="20"/>
+                <w:szCs w:val="20"/>
+              </w:rPr>
+              <w:t xml:space="preserve">Faire un exercice personnel : </w:t>
             </w:r>
             <w:r>
               <w:rPr>
@@ -15173,7 +14853,19 @@
               <w:rPr>
                 <w:rFonts w:cstheme="majorHAnsi"/>
               </w:rPr>
-              <w:t>Étude de cas (jour 2)</w:t>
+              <w:t>Étude de cas (jour 2</w:t>
+            </w:r>
+            <w:r>
+              <w:rPr>
+                <w:rFonts w:cstheme="majorHAnsi"/>
+              </w:rPr>
+              <w:t xml:space="preserve"> après-midi</w:t>
+            </w:r>
+            <w:r>
+              <w:rPr>
+                <w:rFonts w:cstheme="majorHAnsi"/>
+              </w:rPr>
+              <w:t>)</w:t>
             </w:r>
             <w:bookmarkEnd w:id="16"/>
             <w:bookmarkEnd w:id="17"/>
@@ -15799,6 +15491,7 @@
                 <w:sz w:val="20"/>
                 <w:szCs w:val="20"/>
               </w:rPr>
+              <w:lastRenderedPageBreak/>
               <w:t>Corriger l’exercice</w:t>
             </w:r>
           </w:p>
@@ -15863,7 +15556,23 @@
                 <w:sz w:val="20"/>
                 <w:szCs w:val="20"/>
               </w:rPr>
-              <w:t>Poursuivre l’étude de cas en groupes : établissez le lien entre les ER et les couples SR/OV</w:t>
+              <w:t xml:space="preserve">Poursuivre l’étude de cas </w:t>
+            </w:r>
+            <w:r>
+              <w:rPr>
+                <w:rFonts w:asciiTheme="majorHAnsi" w:hAnsiTheme="majorHAnsi" w:cstheme="majorHAnsi"/>
+                <w:sz w:val="20"/>
+                <w:szCs w:val="20"/>
+              </w:rPr>
+              <w:t>collégialement </w:t>
+            </w:r>
+            <w:r>
+              <w:rPr>
+                <w:rFonts w:asciiTheme="majorHAnsi" w:hAnsiTheme="majorHAnsi" w:cstheme="majorHAnsi"/>
+                <w:sz w:val="20"/>
+                <w:szCs w:val="20"/>
+              </w:rPr>
+              <w:t>: établissez le lien entre les ER et les couples SR/OV</w:t>
             </w:r>
           </w:p>
           <w:p>
@@ -15951,7 +15660,6 @@
                 <w:sz w:val="20"/>
                 <w:szCs w:val="20"/>
               </w:rPr>
-              <w:lastRenderedPageBreak/>
               <w:t>[diapositive 1</w:t>
             </w:r>
             <w:r>
@@ -15992,7 +15700,23 @@
                 <w:sz w:val="20"/>
                 <w:szCs w:val="20"/>
               </w:rPr>
-              <w:t>Poursuivre l’étude de cas en groupes : estimez la dangerosité des parties prenantes, en utilisant la technique proposée</w:t>
+              <w:t xml:space="preserve">Poursuivre l’étude de cas </w:t>
+            </w:r>
+            <w:r>
+              <w:rPr>
+                <w:rFonts w:asciiTheme="majorHAnsi" w:hAnsiTheme="majorHAnsi" w:cstheme="majorHAnsi"/>
+                <w:sz w:val="20"/>
+                <w:szCs w:val="20"/>
+              </w:rPr>
+              <w:t>collégialement </w:t>
+            </w:r>
+            <w:r>
+              <w:rPr>
+                <w:rFonts w:asciiTheme="majorHAnsi" w:hAnsiTheme="majorHAnsi" w:cstheme="majorHAnsi"/>
+                <w:sz w:val="20"/>
+                <w:szCs w:val="20"/>
+              </w:rPr>
+              <w:t>: estimez la dangerosité des parties prenantes, en utilisant la technique proposée</w:t>
             </w:r>
           </w:p>
           <w:p>
@@ -16160,7 +15884,23 @@
                 <w:sz w:val="20"/>
                 <w:szCs w:val="20"/>
               </w:rPr>
-              <w:t>Poursuivre l’étude de cas en groupes : élaborez des scénarios stratégiques</w:t>
+              <w:t xml:space="preserve">Poursuivre l’étude de cas </w:t>
+            </w:r>
+            <w:r>
+              <w:rPr>
+                <w:rFonts w:asciiTheme="majorHAnsi" w:hAnsiTheme="majorHAnsi" w:cstheme="majorHAnsi"/>
+                <w:sz w:val="20"/>
+                <w:szCs w:val="20"/>
+              </w:rPr>
+              <w:t>collégialement </w:t>
+            </w:r>
+            <w:r>
+              <w:rPr>
+                <w:rFonts w:asciiTheme="majorHAnsi" w:hAnsiTheme="majorHAnsi" w:cstheme="majorHAnsi"/>
+                <w:sz w:val="20"/>
+                <w:szCs w:val="20"/>
+              </w:rPr>
+              <w:t>: élaborez des scénarios stratégiques</w:t>
             </w:r>
           </w:p>
           <w:p>
@@ -16288,7 +16028,7 @@
                 <w:sz w:val="20"/>
                 <w:szCs w:val="20"/>
               </w:rPr>
-              <w:t>Poursuivre l’étude de cas en petits groupes : élaborez des scénarios opérationnels</w:t>
+              <w:t>Poursuivre l’étude de cas en groupes : élaborez des scénarios opérationnels</w:t>
             </w:r>
           </w:p>
           <w:p>
@@ -16506,7 +16246,6 @@
               </w:rPr>
               <w:t>[</w:t>
             </w:r>
-            <w:proofErr w:type="spellStart"/>
             <w:r>
               <w:rPr>
                 <w:rFonts w:asciiTheme="majorHAnsi" w:hAnsiTheme="majorHAnsi" w:cstheme="majorHAnsi"/>
@@ -16515,9 +16254,120 @@
                 <w:sz w:val="20"/>
                 <w:szCs w:val="20"/>
               </w:rPr>
-              <w:t>paper</w:t>
-            </w:r>
-            <w:proofErr w:type="spellEnd"/>
+              <w:t>paper board</w:t>
+            </w:r>
+            <w:r>
+              <w:rPr>
+                <w:rFonts w:asciiTheme="majorHAnsi" w:hAnsiTheme="majorHAnsi" w:cstheme="majorHAnsi"/>
+                <w:sz w:val="20"/>
+                <w:szCs w:val="20"/>
+              </w:rPr>
+              <w:t>]</w:t>
+            </w:r>
+          </w:p>
+          <w:p>
+            <w:pPr>
+              <w:pStyle w:val="Paragraphedeliste"/>
+              <w:numPr>
+                <w:ilvl w:val="0"/>
+                <w:numId w:val="8"/>
+              </w:numPr>
+              <w:ind w:left="460"/>
+              <w:jc w:val="left"/>
+              <w:rPr>
+                <w:rFonts w:asciiTheme="majorHAnsi" w:hAnsiTheme="majorHAnsi" w:cstheme="majorHAnsi"/>
+                <w:sz w:val="20"/>
+                <w:szCs w:val="20"/>
+              </w:rPr>
+            </w:pPr>
+            <w:r>
+              <w:rPr>
+                <w:rFonts w:asciiTheme="majorHAnsi" w:hAnsiTheme="majorHAnsi" w:cstheme="majorHAnsi"/>
+                <w:sz w:val="20"/>
+                <w:szCs w:val="20"/>
+              </w:rPr>
+              <w:t>Poursuivre l’étude de cas collégialement : déterminez les mesures les plus utiles pour traiter les risques et faites-en un plan d’action</w:t>
+            </w:r>
+          </w:p>
+          <w:p>
+            <w:pPr>
+              <w:pStyle w:val="Paragraphedeliste"/>
+              <w:numPr>
+                <w:ilvl w:val="1"/>
+                <w:numId w:val="8"/>
+              </w:numPr>
+              <w:ind w:left="886"/>
+              <w:jc w:val="left"/>
+              <w:rPr>
+                <w:rFonts w:asciiTheme="majorHAnsi" w:hAnsiTheme="majorHAnsi" w:cstheme="majorHAnsi"/>
+                <w:sz w:val="20"/>
+                <w:szCs w:val="20"/>
+              </w:rPr>
+            </w:pPr>
+            <w:r>
+              <w:rPr>
+                <w:rFonts w:asciiTheme="majorHAnsi" w:hAnsiTheme="majorHAnsi" w:cstheme="majorHAnsi"/>
+                <w:sz w:val="20"/>
+                <w:szCs w:val="20"/>
+              </w:rPr>
+              <w:t>[diapositive 1</w:t>
+            </w:r>
+            <w:r>
+              <w:rPr>
+                <w:rFonts w:asciiTheme="majorHAnsi" w:hAnsiTheme="majorHAnsi" w:cstheme="majorHAnsi"/>
+                <w:sz w:val="20"/>
+                <w:szCs w:val="20"/>
+              </w:rPr>
+              <w:t>50]</w:t>
+            </w:r>
+          </w:p>
+          <w:p>
+            <w:pPr>
+              <w:pStyle w:val="Paragraphedeliste"/>
+              <w:numPr>
+                <w:ilvl w:val="0"/>
+                <w:numId w:val="8"/>
+              </w:numPr>
+              <w:ind w:left="460"/>
+              <w:jc w:val="left"/>
+              <w:rPr>
+                <w:rFonts w:asciiTheme="majorHAnsi" w:hAnsiTheme="majorHAnsi" w:cstheme="majorHAnsi"/>
+                <w:sz w:val="20"/>
+                <w:szCs w:val="20"/>
+              </w:rPr>
+            </w:pPr>
+            <w:r>
+              <w:rPr>
+                <w:rFonts w:asciiTheme="majorHAnsi" w:hAnsiTheme="majorHAnsi" w:cstheme="majorHAnsi"/>
+                <w:sz w:val="20"/>
+                <w:szCs w:val="20"/>
+              </w:rPr>
+              <w:t>Corriger l’exercice</w:t>
+            </w:r>
+          </w:p>
+          <w:p>
+            <w:pPr>
+              <w:pStyle w:val="Paragraphedeliste"/>
+              <w:numPr>
+                <w:ilvl w:val="1"/>
+                <w:numId w:val="8"/>
+              </w:numPr>
+              <w:ind w:left="886"/>
+              <w:jc w:val="left"/>
+              <w:rPr>
+                <w:rFonts w:asciiTheme="majorHAnsi" w:hAnsiTheme="majorHAnsi" w:cstheme="majorHAnsi"/>
+                <w:sz w:val="20"/>
+                <w:szCs w:val="20"/>
+              </w:rPr>
+            </w:pPr>
+            <w:r>
+              <w:rPr>
+                <w:rFonts w:asciiTheme="majorHAnsi" w:hAnsiTheme="majorHAnsi" w:cstheme="majorHAnsi"/>
+                <w:sz w:val="20"/>
+                <w:szCs w:val="20"/>
+              </w:rPr>
+              <w:t>[</w:t>
+            </w:r>
             <w:r>
               <w:rPr>
                 <w:rFonts w:asciiTheme="majorHAnsi" w:hAnsiTheme="majorHAnsi" w:cstheme="majorHAnsi"/>
@@ -16526,166 +16376,8 @@
                 <w:sz w:val="20"/>
                 <w:szCs w:val="20"/>
               </w:rPr>
-              <w:t xml:space="preserve"> </w:t>
-            </w:r>
-            <w:proofErr w:type="spellStart"/>
-            <w:r>
-              <w:rPr>
-                <w:rFonts w:asciiTheme="majorHAnsi" w:hAnsiTheme="majorHAnsi" w:cstheme="majorHAnsi"/>
-                <w:i/>
-                <w:iCs/>
-                <w:sz w:val="20"/>
-                <w:szCs w:val="20"/>
-              </w:rPr>
-              <w:t>board</w:t>
-            </w:r>
-            <w:proofErr w:type="spellEnd"/>
-            <w:r>
-              <w:rPr>
-                <w:rFonts w:asciiTheme="majorHAnsi" w:hAnsiTheme="majorHAnsi" w:cstheme="majorHAnsi"/>
-                <w:sz w:val="20"/>
-                <w:szCs w:val="20"/>
-              </w:rPr>
-              <w:t>]</w:t>
-            </w:r>
-          </w:p>
-          <w:p>
-            <w:pPr>
-              <w:pStyle w:val="Paragraphedeliste"/>
-              <w:numPr>
-                <w:ilvl w:val="0"/>
-                <w:numId w:val="8"/>
-              </w:numPr>
-              <w:ind w:left="460"/>
-              <w:jc w:val="left"/>
-              <w:rPr>
-                <w:rFonts w:asciiTheme="majorHAnsi" w:hAnsiTheme="majorHAnsi" w:cstheme="majorHAnsi"/>
-                <w:sz w:val="20"/>
-                <w:szCs w:val="20"/>
-              </w:rPr>
-            </w:pPr>
-            <w:r>
-              <w:rPr>
-                <w:rFonts w:asciiTheme="majorHAnsi" w:hAnsiTheme="majorHAnsi" w:cstheme="majorHAnsi"/>
-                <w:sz w:val="20"/>
-                <w:szCs w:val="20"/>
-              </w:rPr>
-              <w:t>Poursuivre l’étude de cas collégialement : déterminez les mesures les plus utiles pour traiter les risques et faites-en un plan d’action</w:t>
-            </w:r>
-          </w:p>
-          <w:p>
-            <w:pPr>
-              <w:pStyle w:val="Paragraphedeliste"/>
-              <w:numPr>
-                <w:ilvl w:val="1"/>
-                <w:numId w:val="8"/>
-              </w:numPr>
-              <w:ind w:left="886"/>
-              <w:jc w:val="left"/>
-              <w:rPr>
-                <w:rFonts w:asciiTheme="majorHAnsi" w:hAnsiTheme="majorHAnsi" w:cstheme="majorHAnsi"/>
-                <w:sz w:val="20"/>
-                <w:szCs w:val="20"/>
-              </w:rPr>
-            </w:pPr>
-            <w:r>
-              <w:rPr>
-                <w:rFonts w:asciiTheme="majorHAnsi" w:hAnsiTheme="majorHAnsi" w:cstheme="majorHAnsi"/>
-                <w:sz w:val="20"/>
-                <w:szCs w:val="20"/>
-              </w:rPr>
-              <w:t>[diapositive 1</w:t>
-            </w:r>
-            <w:r>
-              <w:rPr>
-                <w:rFonts w:asciiTheme="majorHAnsi" w:hAnsiTheme="majorHAnsi" w:cstheme="majorHAnsi"/>
-                <w:sz w:val="20"/>
-                <w:szCs w:val="20"/>
-              </w:rPr>
-              <w:t>50]</w:t>
-            </w:r>
-          </w:p>
-          <w:p>
-            <w:pPr>
-              <w:pStyle w:val="Paragraphedeliste"/>
-              <w:numPr>
-                <w:ilvl w:val="0"/>
-                <w:numId w:val="8"/>
-              </w:numPr>
-              <w:ind w:left="460"/>
-              <w:jc w:val="left"/>
-              <w:rPr>
-                <w:rFonts w:asciiTheme="majorHAnsi" w:hAnsiTheme="majorHAnsi" w:cstheme="majorHAnsi"/>
-                <w:sz w:val="20"/>
-                <w:szCs w:val="20"/>
-              </w:rPr>
-            </w:pPr>
-            <w:r>
-              <w:rPr>
-                <w:rFonts w:asciiTheme="majorHAnsi" w:hAnsiTheme="majorHAnsi" w:cstheme="majorHAnsi"/>
-                <w:sz w:val="20"/>
-                <w:szCs w:val="20"/>
-              </w:rPr>
-              <w:t>Corriger l’exercice</w:t>
-            </w:r>
-          </w:p>
-          <w:p>
-            <w:pPr>
-              <w:pStyle w:val="Paragraphedeliste"/>
-              <w:numPr>
-                <w:ilvl w:val="1"/>
-                <w:numId w:val="8"/>
-              </w:numPr>
-              <w:ind w:left="886"/>
-              <w:jc w:val="left"/>
-              <w:rPr>
-                <w:rFonts w:asciiTheme="majorHAnsi" w:hAnsiTheme="majorHAnsi" w:cstheme="majorHAnsi"/>
-                <w:sz w:val="20"/>
-                <w:szCs w:val="20"/>
-              </w:rPr>
-            </w:pPr>
-            <w:r>
-              <w:rPr>
-                <w:rFonts w:asciiTheme="majorHAnsi" w:hAnsiTheme="majorHAnsi" w:cstheme="majorHAnsi"/>
-                <w:sz w:val="20"/>
-                <w:szCs w:val="20"/>
-              </w:rPr>
-              <w:t>[</w:t>
-            </w:r>
-            <w:proofErr w:type="spellStart"/>
-            <w:r>
-              <w:rPr>
-                <w:rFonts w:asciiTheme="majorHAnsi" w:hAnsiTheme="majorHAnsi" w:cstheme="majorHAnsi"/>
-                <w:i/>
-                <w:iCs/>
-                <w:sz w:val="20"/>
-                <w:szCs w:val="20"/>
-              </w:rPr>
-              <w:t>paper</w:t>
-            </w:r>
-            <w:proofErr w:type="spellEnd"/>
-            <w:r>
-              <w:rPr>
-                <w:rFonts w:asciiTheme="majorHAnsi" w:hAnsiTheme="majorHAnsi" w:cstheme="majorHAnsi"/>
-                <w:i/>
-                <w:iCs/>
-                <w:sz w:val="20"/>
-                <w:szCs w:val="20"/>
-              </w:rPr>
-              <w:t xml:space="preserve"> </w:t>
-            </w:r>
-            <w:proofErr w:type="spellStart"/>
-            <w:r>
-              <w:rPr>
-                <w:rFonts w:asciiTheme="majorHAnsi" w:hAnsiTheme="majorHAnsi" w:cstheme="majorHAnsi"/>
-                <w:i/>
-                <w:iCs/>
-                <w:sz w:val="20"/>
-                <w:szCs w:val="20"/>
-              </w:rPr>
-              <w:t>board</w:t>
-            </w:r>
-            <w:proofErr w:type="spellEnd"/>
+              <w:t>paper board</w:t>
+            </w:r>
             <w:r>
               <w:rPr>
                 <w:rFonts w:asciiTheme="majorHAnsi" w:hAnsiTheme="majorHAnsi" w:cstheme="majorHAnsi"/>
@@ -17763,7 +17455,6 @@
         <w:dataBinding w:prefixMappings="xmlns:ns0='http://purl.org/dc/elements/1.1/' xmlns:ns1='http://schemas.openxmlformats.org/package/2006/metadata/core-properties' " w:xpath="/ns1:coreProperties[1]/ns1:contentStatus[1]" w:storeItemID="{6C3C8BC8-F283-45AE-878A-BAB7291924A1}"/>
         <w:text/>
       </w:sdtPr>
-      <w:sdtEndPr/>
       <w:sdtContent>
         <w:r>
           <w:t>Amélioration continue</w:t>
@@ -18192,7 +17883,6 @@
         <w:dataBinding w:prefixMappings="xmlns:ns0='http://purl.org/dc/elements/1.1/' xmlns:ns1='http://schemas.openxmlformats.org/package/2006/metadata/core-properties' " w:xpath="/ns1:coreProperties[1]/ns1:contentStatus[1]" w:storeItemID="{6C3C8BC8-F283-45AE-878A-BAB7291924A1}"/>
         <w:text/>
       </w:sdtPr>
-      <w:sdtEndPr/>
       <w:sdtContent>
         <w:r>
           <w:t>Amélioration continue</w:t>
@@ -18216,10 +17906,9 @@
         <w:dataBinding w:prefixMappings="xmlns:ns0='http://schemas.microsoft.com/office/2006/metadata/properties' xmlns:ns1='http://www.w3.org/2001/XMLSchema-instance' xmlns:ns2='http://schemas.microsoft.com/office/infopath/2007/PartnerControls' xmlns:ns3='6d93d202-47fc-4405-873a-cab67cc5f1b2' xmlns:ns4='64acb2c5-0a2b-4bda-bd34-58e36cbb80d2' " w:xpath="/ns0:properties[1]/documentManagement[1]/ns3:TPAppVersion[1]" w:storeItemID="{2DF866C4-50CD-47D7-BED6-205C60F51F83}"/>
         <w:text/>
       </w:sdtPr>
-      <w:sdtEndPr/>
       <w:sdtContent>
         <w:r>
-          <w:t>21/10/2025</w:t>
+          <w:t>19/11/2025</w:t>
         </w:r>
       </w:sdtContent>
     </w:sdt>
@@ -18337,7 +18026,6 @@
         <w:dataBinding w:prefixMappings="xmlns:ns0='http://purl.org/dc/elements/1.1/' xmlns:ns1='http://schemas.openxmlformats.org/package/2006/metadata/core-properties' " w:xpath="/ns1:coreProperties[1]/ns0:title[1]" w:storeItemID="{6C3C8BC8-F283-45AE-878A-BAB7291924A1}"/>
         <w:text/>
       </w:sdtPr>
-      <w:sdtEndPr/>
       <w:sdtContent>
         <w:r>
           <w:rPr>
@@ -18379,30 +18067,13 @@
         <w:dataBinding w:prefixMappings="xmlns:ns0='http://purl.org/dc/elements/1.1/' xmlns:ns1='http://schemas.openxmlformats.org/package/2006/metadata/core-properties' " w:xpath="/ns1:coreProperties[1]/ns0:subject[1]" w:storeItemID="{6C3C8BC8-F283-45AE-878A-BAB7291924A1}"/>
         <w:text/>
       </w:sdtPr>
-      <w:sdtEndPr/>
       <w:sdtContent>
-        <w:proofErr w:type="spellStart"/>
         <w:r>
           <w:rPr>
             <w:lang w:val="en-US"/>
           </w:rPr>
-          <w:t>Livret</w:t>
+          <w:t>Livret formateur</w:t>
         </w:r>
-        <w:proofErr w:type="spellEnd"/>
-        <w:r>
-          <w:rPr>
-            <w:lang w:val="en-US"/>
-          </w:rPr>
-          <w:t xml:space="preserve"> </w:t>
-        </w:r>
-        <w:proofErr w:type="spellStart"/>
-        <w:r>
-          <w:rPr>
-            <w:lang w:val="en-US"/>
-          </w:rPr>
-          <w:t>formateur</w:t>
-        </w:r>
-        <w:proofErr w:type="spellEnd"/>
       </w:sdtContent>
     </w:sdt>
     <w:r>
@@ -18425,13 +18096,12 @@
         <w:dataBinding w:prefixMappings="xmlns:ns0='http://schemas.microsoft.com/office/2006/metadata/properties' xmlns:ns1='http://www.w3.org/2001/XMLSchema-instance' xmlns:ns2='http://schemas.microsoft.com/office/infopath/2007/PartnerControls' xmlns:ns3='6d93d202-47fc-4405-873a-cab67cc5f1b2' xmlns:ns4='64acb2c5-0a2b-4bda-bd34-58e36cbb80d2' " w:xpath="/ns0:properties[1]/documentManagement[1]/ns3:TPAppVersion[1]" w:storeItemID="{2DF866C4-50CD-47D7-BED6-205C60F51F83}"/>
         <w:text/>
       </w:sdtPr>
-      <w:sdtEndPr/>
       <w:sdtContent>
         <w:r>
           <w:rPr>
             <w:lang w:val="en-US"/>
           </w:rPr>
-          <w:t>21/10</w:t>
+          <w:t>19/11</w:t>
         </w:r>
         <w:r>
           <w:rPr>
@@ -22196,9 +21866,11 @@
     <w:rsid w:val="0087743C"/>
     <w:rsid w:val="008D635C"/>
     <w:rsid w:val="00912DB5"/>
+    <w:rsid w:val="009263CE"/>
     <w:rsid w:val="009B393D"/>
     <w:rsid w:val="009E232C"/>
     <w:rsid w:val="00A41199"/>
+    <w:rsid w:val="00A46C54"/>
     <w:rsid w:val="00AB247D"/>
     <w:rsid w:val="00AD06F8"/>
     <w:rsid w:val="00B35366"/>
@@ -23073,7 +22745,7 @@
     <Markets xmlns="6d93d202-47fc-4405-873a-cab67cc5f1b2"/>
     <OriginalSourceMarket xmlns="6d93d202-47fc-4405-873a-cab67cc5f1b2">english</OriginalSourceMarket>
     <TPInstallLocation xmlns="6d93d202-47fc-4405-873a-cab67cc5f1b2" xsi:nil="true"/>
-    <TPAppVersion xmlns="6d93d202-47fc-4405-873a-cab67cc5f1b2">21/10/2025</TPAppVersion>
+    <TPAppVersion xmlns="6d93d202-47fc-4405-873a-cab67cc5f1b2">19/11/2025</TPAppVersion>
     <TPCommandLine xmlns="6d93d202-47fc-4405-873a-cab67cc5f1b2" xsi:nil="true"/>
     <APAuthor xmlns="6d93d202-47fc-4405-873a-cab67cc5f1b2">
       <UserInfo>
@@ -23186,7 +22858,12 @@
 </file>
 
 <file path=customXml/item3.xml><?xml version="1.0" encoding="utf-8"?>
-<b:Sources xmlns:b="http://schemas.openxmlformats.org/officeDocument/2006/bibliography" xmlns="http://schemas.openxmlformats.org/officeDocument/2006/bibliography" SelectedStyle="\APASixthEditionOfficeOnline.xsl" StyleName="APA" Version="6"/>
+<?mso-contentType ?>
+<FormTemplates xmlns="http://schemas.microsoft.com/sharepoint/v3/contenttype/forms">
+  <Display>DocumentLibraryForm</Display>
+  <Edit>AssetEditForm</Edit>
+  <New>DocumentLibraryForm</New>
+</FormTemplates>
 </file>
 
 <file path=customXml/item4.xml><?xml version="1.0" encoding="utf-8"?>
@@ -24249,12 +23926,7 @@
 </file>
 
 <file path=customXml/item5.xml><?xml version="1.0" encoding="utf-8"?>
-<?mso-contentType ?>
-<FormTemplates xmlns="http://schemas.microsoft.com/sharepoint/v3/contenttype/forms">
-  <Display>DocumentLibraryForm</Display>
-  <Edit>AssetEditForm</Edit>
-  <New>DocumentLibraryForm</New>
-</FormTemplates>
+<b:Sources xmlns:b="http://schemas.openxmlformats.org/officeDocument/2006/bibliography" xmlns="http://schemas.openxmlformats.org/officeDocument/2006/bibliography" SelectedStyle="\APASixthEditionOfficeOnline.xsl" StyleName="APA" Version="6"/>
 </file>
 
 <file path=customXml/itemProps1.xml><?xml version="1.0" encoding="utf-8"?>
@@ -24268,24 +23940,18 @@
 <file path=customXml/itemProps2.xml><?xml version="1.0" encoding="utf-8"?>
 <ds:datastoreItem xmlns:ds="http://schemas.openxmlformats.org/officeDocument/2006/customXml" ds:itemID="{2DF866C4-50CD-47D7-BED6-205C60F51F83}">
   <ds:schemaRefs>
-    <ds:schemaRef ds:uri="6d93d202-47fc-4405-873a-cab67cc5f1b2"/>
-    <ds:schemaRef ds:uri="http://purl.org/dc/terms/"/>
-    <ds:schemaRef ds:uri="64acb2c5-0a2b-4bda-bd34-58e36cbb80d2"/>
-    <ds:schemaRef ds:uri="http://schemas.microsoft.com/office/2006/documentManagement/types"/>
-    <ds:schemaRef ds:uri="http://purl.org/dc/elements/1.1/"/>
     <ds:schemaRef ds:uri="http://schemas.microsoft.com/office/2006/metadata/properties"/>
     <ds:schemaRef ds:uri="http://schemas.microsoft.com/office/infopath/2007/PartnerControls"/>
-    <ds:schemaRef ds:uri="http://schemas.openxmlformats.org/package/2006/metadata/core-properties"/>
-    <ds:schemaRef ds:uri="http://www.w3.org/XML/1998/namespace"/>
-    <ds:schemaRef ds:uri="http://purl.org/dc/dcmitype/"/>
+    <ds:schemaRef ds:uri="6d93d202-47fc-4405-873a-cab67cc5f1b2"/>
+    <ds:schemaRef ds:uri="64acb2c5-0a2b-4bda-bd34-58e36cbb80d2"/>
   </ds:schemaRefs>
 </ds:datastoreItem>
 </file>
 
 <file path=customXml/itemProps3.xml><?xml version="1.0" encoding="utf-8"?>
-<ds:datastoreItem xmlns:ds="http://schemas.openxmlformats.org/officeDocument/2006/customXml" ds:itemID="{AB9AA636-D291-4B2E-BBD8-8A9285B3238E}">
+<ds:datastoreItem xmlns:ds="http://schemas.openxmlformats.org/officeDocument/2006/customXml" ds:itemID="{0997F6B8-5DA6-4A19-9077-FDDDE75F6343}">
   <ds:schemaRefs>
-    <ds:schemaRef ds:uri="http://schemas.openxmlformats.org/officeDocument/2006/bibliography"/>
+    <ds:schemaRef ds:uri="http://schemas.microsoft.com/sharepoint/v3/contenttype/forms"/>
   </ds:schemaRefs>
 </ds:datastoreItem>
 </file>
@@ -24310,9 +23976,9 @@
 </file>
 
 <file path=customXml/itemProps5.xml><?xml version="1.0" encoding="utf-8"?>
-<ds:datastoreItem xmlns:ds="http://schemas.openxmlformats.org/officeDocument/2006/customXml" ds:itemID="{0997F6B8-5DA6-4A19-9077-FDDDE75F6343}">
+<ds:datastoreItem xmlns:ds="http://schemas.openxmlformats.org/officeDocument/2006/customXml" ds:itemID="{AB9AA636-D291-4B2E-BBD8-8A9285B3238E}">
   <ds:schemaRefs>
-    <ds:schemaRef ds:uri="http://schemas.microsoft.com/sharepoint/v3/contenttype/forms"/>
+    <ds:schemaRef ds:uri="http://schemas.openxmlformats.org/officeDocument/2006/bibliography"/>
   </ds:schemaRefs>
 </ds:datastoreItem>
 </file>
</xml_diff>